<commit_message>
feat(adesioni): opzione scelta nel modulo, rendicontazione automatica, rimosso rinnovo duplicato
- Mostra accanto al premio (nel modulo docx/PDF e nell'anteprima web) quale
  opzione di copertura è stata scelta (solo assistenza / solo tutela legale /
  entrambe).
- La data di rendicontazione viene calcolata automaticamente come il primo
  giorno del mese della data effetto (data inizio validità).
- Rimosso il pulsante "Rinnova +1 anno" dalla sezione Record: la stessa
  funzionalità è già disponibile nella sezione Scadenze.
</commit_message>
<xml_diff>
--- a/web/assets/adesioni/modulo_template.docx
+++ b/web/assets/adesioni/modulo_template.docx
@@ -64,35 +64,7 @@
           <w:rtl w:val="0"/>
           <w:lang w:val="it-IT"/>
         </w:rPr>
-        <w:t xml:space="preserve">ASSISTENZA STRADALE </w:t>
-      </w:r>
-      <w:r>
-        <w:rPr>
-          <w:rtl w:val="0"/>
-          <w:lang w:val="it-IT"/>
-        </w:rPr>
-        <w:t xml:space="preserve">– </w:t>
-      </w:r>
-      <w:r>
-        <w:rPr>
-          <w:rtl w:val="0"/>
-          <w:lang w:val="it-IT"/>
-        </w:rPr>
-        <w:t>TUTELA LEGALE CIRCOLA</w:t>
-      </w:r>
-      <w:r>
-        <w:rPr>
-          <w:rtl w:val="0"/>
-          <w:lang w:val="it-IT"/>
-        </w:rPr>
-        <w:t>ZI</w:t>
-      </w:r>
-      <w:r>
-        <w:rPr>
-          <w:rtl w:val="0"/>
-          <w:lang w:val="it-IT"/>
-        </w:rPr>
-        <w:t>ONE</w:t>
+        <w:t xml:space="preserve">ASSISTENZA STRADALE – TUTELA LEGALE CIRCOLAZIONE</w:t>
       </w:r>
     </w:p>
     <w:p>
@@ -120,21 +92,7 @@
           <w:rtl w:val="0"/>
           <w:lang w:val="it-IT"/>
         </w:rPr>
-        <w:t>Inter Partner Assistance S.A. - Rappresentanza Generale per l</w:t>
-      </w:r>
-      <w:r>
-        <w:rPr>
-          <w:rtl w:val="0"/>
-          <w:lang w:val="it-IT"/>
-        </w:rPr>
-        <w:t>’</w:t>
-      </w:r>
-      <w:r>
-        <w:rPr>
-          <w:rtl w:val="0"/>
-          <w:lang w:val="it-IT"/>
-        </w:rPr>
-        <w:t>Italia</w:t>
+        <w:t>Inter Partner Assistance S.A. - Rappresentanza Generale per l’Italia</w:t>
       </w:r>
     </w:p>
     <w:p>
@@ -211,21 +169,7 @@
           <w:rtl w:val="0"/>
           <w:lang w:val="it-IT"/>
         </w:rPr>
-        <w:t>Residenza {{residenza}} Citt</w:t>
-      </w:r>
-      <w:r>
-        <w:rPr>
-          <w:rtl w:val="0"/>
-          <w:lang w:val="it-IT"/>
-        </w:rPr>
-        <w:t xml:space="preserve">à </w:t>
-      </w:r>
-      <w:r>
-        <w:rPr>
-          <w:rtl w:val="0"/>
-          <w:lang w:val="it-IT"/>
-        </w:rPr>
-        <w:t>{{citta}} CAP {{cap}}</w:t>
+        <w:t xml:space="preserve">Residenza {{residenza}} Città {{citta}} CAP {{cap}}</w:t>
       </w:r>
     </w:p>
     <w:p>
@@ -246,17 +190,7 @@
           <w:rStyle w:val="Hyperlink.0"/>
         </w:rPr>
         <w:fldChar w:fldCharType="begin" w:fldLock="0"/>
-      </w:r>
-      <w:r>
-        <w:rPr>
-          <w:rStyle w:val="Hyperlink.0"/>
-        </w:rPr>
         <w:instrText xml:space="preserve"> HYPERLINK "mailto:taraburcamaria6@gmail.com"</w:instrText>
-      </w:r>
-      <w:r>
-        <w:rPr>
-          <w:rStyle w:val="Hyperlink.0"/>
-        </w:rPr>
         <w:fldChar w:fldCharType="separate" w:fldLock="0"/>
       </w:r>
       <w:r>
@@ -360,21 +294,21 @@
           <w:rtl w:val="0"/>
           <w:lang w:val="it-IT"/>
         </w:rPr>
-        <w:t xml:space="preserve">PREMIO </w:t>
+        <w:t xml:space="preserve">PREMIO € {{premio}}</w:t>
       </w:r>
+    </w:p>
+    <w:p>
+      <w:pPr>
+        <w:pStyle w:val="Normal.0"/>
+        <w:spacing w:after="0" w:line="240" w:lineRule="auto"/>
+        <w:jc w:val="center"/>
+      </w:pPr>
       <w:r>
         <w:rPr>
           <w:rtl w:val="0"/>
           <w:lang w:val="it-IT"/>
         </w:rPr>
-        <w:t xml:space="preserve">€ </w:t>
-      </w:r>
-      <w:r>
-        <w:rPr>
-          <w:rtl w:val="0"/>
-          <w:lang w:val="it-IT"/>
-        </w:rPr>
-        <w:t>{{premio}}</w:t>
+        <w:t xml:space="preserve">{{opzione}}</w:t>
       </w:r>
     </w:p>
     <w:tbl>
@@ -444,33 +378,7 @@
                 <w:rtl w:val="0"/>
                 <w:lang w:val="it-IT"/>
               </w:rPr>
-              <w:t xml:space="preserve">PACCHETTO A </w:t>
-            </w:r>
-            <w:r>
-              <w:rPr>
-                <w:rFonts w:ascii="Source Sans Pro" w:cs="Source Sans Pro" w:hAnsi="Source Sans Pro" w:eastAsia="Source Sans Pro"/>
-                <w:b w:val="1"/>
-                <w:bCs w:val="1"/>
-                <w:sz w:val="16"/>
-                <w:szCs w:val="16"/>
-                <w:shd w:val="nil" w:color="auto" w:fill="auto"/>
-                <w:rtl w:val="0"/>
-                <w:lang w:val="it-IT"/>
-              </w:rPr>
-              <w:t xml:space="preserve">– </w:t>
-            </w:r>
-            <w:r>
-              <w:rPr>
-                <w:rFonts w:ascii="Source Sans Pro" w:cs="Source Sans Pro" w:hAnsi="Source Sans Pro" w:eastAsia="Source Sans Pro"/>
-                <w:b w:val="1"/>
-                <w:bCs w:val="1"/>
-                <w:sz w:val="16"/>
-                <w:szCs w:val="16"/>
-                <w:shd w:val="nil" w:color="auto" w:fill="auto"/>
-                <w:rtl w:val="0"/>
-                <w:lang w:val="it-IT"/>
-              </w:rPr>
-              <w:t xml:space="preserve">ASSISTENZA STRADALE - PREMIO UNITARIO </w:t>
+              <w:t xml:space="preserve">PACCHETTO A – ASSISTENZA STRADALE - PREMIO UNITARIO </w:t>
             </w:r>
           </w:p>
         </w:tc>
@@ -633,20 +541,7 @@
                 <w:rtl w:val="0"/>
                 <w:lang w:val="it-IT"/>
               </w:rPr>
-              <w:t xml:space="preserve">Premio netto </w:t>
-            </w:r>
-            <w:r>
-              <w:rPr>
-                <w:rFonts w:ascii="Source Sans Pro" w:cs="Source Sans Pro" w:hAnsi="Source Sans Pro" w:eastAsia="Source Sans Pro"/>
-                <w:b w:val="1"/>
-                <w:bCs w:val="1"/>
-                <w:sz w:val="16"/>
-                <w:szCs w:val="16"/>
-                <w:shd w:val="nil" w:color="auto" w:fill="auto"/>
-                <w:rtl w:val="0"/>
-                <w:lang w:val="it-IT"/>
-              </w:rPr>
-              <w:t>€</w:t>
+              <w:t xml:space="preserve">Premio netto €</w:t>
             </w:r>
           </w:p>
         </w:tc>
@@ -724,20 +619,7 @@
                 <w:rtl w:val="0"/>
                 <w:lang w:val="it-IT"/>
               </w:rPr>
-              <w:t xml:space="preserve">Premio lordo </w:t>
-            </w:r>
-            <w:r>
-              <w:rPr>
-                <w:rFonts w:ascii="Source Sans Pro" w:cs="Source Sans Pro" w:hAnsi="Source Sans Pro" w:eastAsia="Source Sans Pro"/>
-                <w:b w:val="1"/>
-                <w:bCs w:val="1"/>
-                <w:sz w:val="16"/>
-                <w:szCs w:val="16"/>
-                <w:shd w:val="nil" w:color="auto" w:fill="auto"/>
-                <w:rtl w:val="0"/>
-                <w:lang w:val="it-IT"/>
-              </w:rPr>
-              <w:t>€</w:t>
+              <w:t xml:space="preserve">Premio lordo €</w:t>
             </w:r>
           </w:p>
         </w:tc>
@@ -1014,33 +896,7 @@
                 <w:rtl w:val="0"/>
                 <w:lang w:val="it-IT"/>
               </w:rPr>
-              <w:t xml:space="preserve">PACCHETTO B </w:t>
-            </w:r>
-            <w:r>
-              <w:rPr>
-                <w:rFonts w:ascii="Source Sans Pro" w:cs="Source Sans Pro" w:hAnsi="Source Sans Pro" w:eastAsia="Source Sans Pro"/>
-                <w:b w:val="1"/>
-                <w:bCs w:val="1"/>
-                <w:sz w:val="16"/>
-                <w:szCs w:val="16"/>
-                <w:shd w:val="nil" w:color="auto" w:fill="auto"/>
-                <w:rtl w:val="0"/>
-                <w:lang w:val="it-IT"/>
-              </w:rPr>
-              <w:t xml:space="preserve">– </w:t>
-            </w:r>
-            <w:r>
-              <w:rPr>
-                <w:rFonts w:ascii="Source Sans Pro" w:cs="Source Sans Pro" w:hAnsi="Source Sans Pro" w:eastAsia="Source Sans Pro"/>
-                <w:b w:val="1"/>
-                <w:bCs w:val="1"/>
-                <w:sz w:val="16"/>
-                <w:szCs w:val="16"/>
-                <w:shd w:val="nil" w:color="auto" w:fill="auto"/>
-                <w:rtl w:val="0"/>
-                <w:lang w:val="it-IT"/>
-              </w:rPr>
-              <w:t xml:space="preserve">TUTELA LEGALE PENALE - PREMIO UNITARIO </w:t>
+              <w:t xml:space="preserve">PACCHETTO B – TUTELA LEGALE PENALE - PREMIO UNITARIO </w:t>
             </w:r>
           </w:p>
         </w:tc>
@@ -1203,20 +1059,7 @@
                 <w:rtl w:val="0"/>
                 <w:lang w:val="it-IT"/>
               </w:rPr>
-              <w:t xml:space="preserve">Premio netto </w:t>
-            </w:r>
-            <w:r>
-              <w:rPr>
-                <w:rFonts w:ascii="Source Sans Pro" w:cs="Source Sans Pro" w:hAnsi="Source Sans Pro" w:eastAsia="Source Sans Pro"/>
-                <w:b w:val="1"/>
-                <w:bCs w:val="1"/>
-                <w:sz w:val="16"/>
-                <w:szCs w:val="16"/>
-                <w:shd w:val="nil" w:color="auto" w:fill="auto"/>
-                <w:rtl w:val="0"/>
-                <w:lang w:val="it-IT"/>
-              </w:rPr>
-              <w:t>€</w:t>
+              <w:t xml:space="preserve">Premio netto €</w:t>
             </w:r>
           </w:p>
         </w:tc>
@@ -1294,20 +1137,7 @@
                 <w:rtl w:val="0"/>
                 <w:lang w:val="it-IT"/>
               </w:rPr>
-              <w:t xml:space="preserve">Premio lordo </w:t>
-            </w:r>
-            <w:r>
-              <w:rPr>
-                <w:rFonts w:ascii="Source Sans Pro" w:cs="Source Sans Pro" w:hAnsi="Source Sans Pro" w:eastAsia="Source Sans Pro"/>
-                <w:b w:val="1"/>
-                <w:bCs w:val="1"/>
-                <w:sz w:val="16"/>
-                <w:szCs w:val="16"/>
-                <w:shd w:val="nil" w:color="auto" w:fill="auto"/>
-                <w:rtl w:val="0"/>
-                <w:lang w:val="it-IT"/>
-              </w:rPr>
-              <w:t>€</w:t>
+              <w:t xml:space="preserve">Premio lordo €</w:t>
             </w:r>
           </w:p>
         </w:tc>
@@ -1584,33 +1414,7 @@
                 <w:rtl w:val="0"/>
                 <w:lang w:val="it-IT"/>
               </w:rPr>
-              <w:t xml:space="preserve">PACCHETTO C </w:t>
-            </w:r>
-            <w:r>
-              <w:rPr>
-                <w:rFonts w:ascii="Source Sans Pro" w:cs="Source Sans Pro" w:hAnsi="Source Sans Pro" w:eastAsia="Source Sans Pro"/>
-                <w:b w:val="1"/>
-                <w:bCs w:val="1"/>
-                <w:sz w:val="16"/>
-                <w:szCs w:val="16"/>
-                <w:shd w:val="nil" w:color="auto" w:fill="auto"/>
-                <w:rtl w:val="0"/>
-                <w:lang w:val="it-IT"/>
-              </w:rPr>
-              <w:t xml:space="preserve">– </w:t>
-            </w:r>
-            <w:r>
-              <w:rPr>
-                <w:rFonts w:ascii="Source Sans Pro" w:cs="Source Sans Pro" w:hAnsi="Source Sans Pro" w:eastAsia="Source Sans Pro"/>
-                <w:b w:val="1"/>
-                <w:bCs w:val="1"/>
-                <w:sz w:val="16"/>
-                <w:szCs w:val="16"/>
-                <w:shd w:val="nil" w:color="auto" w:fill="auto"/>
-                <w:rtl w:val="0"/>
-                <w:lang w:val="it-IT"/>
-              </w:rPr>
-              <w:t xml:space="preserve">ASSISTENZA STRADALE E TUTELA LEGALE PENALE- PREMIO UNITARIO </w:t>
+              <w:t xml:space="preserve">PACCHETTO C – ASSISTENZA STRADALE E TUTELA LEGALE PENALE- PREMIO UNITARIO </w:t>
             </w:r>
           </w:p>
         </w:tc>
@@ -1773,20 +1577,7 @@
                 <w:rtl w:val="0"/>
                 <w:lang w:val="it-IT"/>
               </w:rPr>
-              <w:t xml:space="preserve">Premio netto </w:t>
-            </w:r>
-            <w:r>
-              <w:rPr>
-                <w:rFonts w:ascii="Source Sans Pro" w:cs="Source Sans Pro" w:hAnsi="Source Sans Pro" w:eastAsia="Source Sans Pro"/>
-                <w:b w:val="1"/>
-                <w:bCs w:val="1"/>
-                <w:sz w:val="16"/>
-                <w:szCs w:val="16"/>
-                <w:shd w:val="nil" w:color="auto" w:fill="auto"/>
-                <w:rtl w:val="0"/>
-                <w:lang w:val="it-IT"/>
-              </w:rPr>
-              <w:t>€</w:t>
+              <w:t xml:space="preserve">Premio netto €</w:t>
             </w:r>
           </w:p>
         </w:tc>
@@ -1864,20 +1655,7 @@
                 <w:rtl w:val="0"/>
                 <w:lang w:val="it-IT"/>
               </w:rPr>
-              <w:t xml:space="preserve">Premio lordo </w:t>
-            </w:r>
-            <w:r>
-              <w:rPr>
-                <w:rFonts w:ascii="Source Sans Pro" w:cs="Source Sans Pro" w:hAnsi="Source Sans Pro" w:eastAsia="Source Sans Pro"/>
-                <w:b w:val="1"/>
-                <w:bCs w:val="1"/>
-                <w:sz w:val="16"/>
-                <w:szCs w:val="16"/>
-                <w:shd w:val="nil" w:color="auto" w:fill="auto"/>
-                <w:rtl w:val="0"/>
-                <w:lang w:val="it-IT"/>
-              </w:rPr>
-              <w:t>€</w:t>
+              <w:t xml:space="preserve">Premio lordo €</w:t>
             </w:r>
           </w:p>
         </w:tc>
@@ -2672,25 +2450,7 @@
                                 <w:rtl w:val="0"/>
                                 <w:lang w:val="it-IT"/>
                               </w:rPr>
-                              <w:t>Firma dell</w:t>
-                            </w:r>
-                            <w:r>
-                              <w:rPr>
-                                <w:sz w:val="20"/>
-                                <w:szCs w:val="20"/>
-                                <w:rtl w:val="0"/>
-                                <w:lang w:val="it-IT"/>
-                              </w:rPr>
-                              <w:t>’</w:t>
-                            </w:r>
-                            <w:r>
-                              <w:rPr>
-                                <w:sz w:val="20"/>
-                                <w:szCs w:val="20"/>
-                                <w:rtl w:val="0"/>
-                                <w:lang w:val="it-IT"/>
-                              </w:rPr>
-                              <w:t>Aderente</w:t>
+                              <w:t>Firma dell’Aderente</w:t>
                             </w:r>
                           </w:p>
                           <w:p>
@@ -2736,7 +2496,6 @@
                             <w:r>
                               <w:tab/>
                             </w:r>
-                            <w:r/>
                           </w:p>
                         </w:txbxContent>
                       </wps:txbx>
@@ -2847,25 +2606,7 @@
                           <w:rtl w:val="0"/>
                           <w:lang w:val="it-IT"/>
                         </w:rPr>
-                        <w:t>Firma dell</w:t>
-                      </w:r>
-                      <w:r>
-                        <w:rPr>
-                          <w:sz w:val="20"/>
-                          <w:szCs w:val="20"/>
-                          <w:rtl w:val="0"/>
-                          <w:lang w:val="it-IT"/>
-                        </w:rPr>
-                        <w:t>’</w:t>
-                      </w:r>
-                      <w:r>
-                        <w:rPr>
-                          <w:sz w:val="20"/>
-                          <w:szCs w:val="20"/>
-                          <w:rtl w:val="0"/>
-                          <w:lang w:val="it-IT"/>
-                        </w:rPr>
-                        <w:t>Aderente</w:t>
+                        <w:t>Firma dell’Aderente</w:t>
                       </w:r>
                     </w:p>
                     <w:p>
@@ -2911,7 +2652,6 @@
                       <w:r>
                         <w:tab/>
                       </w:r>
-                      <w:r/>
                     </w:p>
                   </w:txbxContent>
                 </v:textbox>
@@ -2977,61 +2717,7 @@
                                 <w:rtl w:val="0"/>
                                 <w:lang w:val="it-IT"/>
                               </w:rPr>
-                              <w:t>Dichiaro di aver ricevuto</w:t>
-                            </w:r>
-                            <w:r>
-                              <w:rPr>
-                                <w:sz w:val="20"/>
-                                <w:szCs w:val="20"/>
-                                <w:rtl w:val="0"/>
-                                <w:lang w:val="it-IT"/>
-                              </w:rPr>
-                              <w:t> </w:t>
-                            </w:r>
-                            <w:r>
-                              <w:rPr>
-                                <w:sz w:val="20"/>
-                                <w:szCs w:val="20"/>
-                                <w:rtl w:val="0"/>
-                                <w:lang w:val="it-IT"/>
-                              </w:rPr>
-                              <w:t>la Documentazione Informativa Precontrattuale che disciplina il rapporto convenuto a mio favore tra CSA CONSULENZE &amp; SOLUZIONI AZIENDALI S.R.L. ed Inter Partner Assistance S.A. Rappresentanza Generale per L</w:t>
-                            </w:r>
-                            <w:r>
-                              <w:rPr>
-                                <w:sz w:val="20"/>
-                                <w:szCs w:val="20"/>
-                                <w:rtl w:val="0"/>
-                                <w:lang w:val="it-IT"/>
-                              </w:rPr>
-                              <w:t>’</w:t>
-                            </w:r>
-                            <w:r>
-                              <w:rPr>
-                                <w:sz w:val="20"/>
-                                <w:szCs w:val="20"/>
-                                <w:rtl w:val="0"/>
-                                <w:lang w:val="it-IT"/>
-                              </w:rPr>
-                              <w:t>Italia (Set Informativo), e di aver letto e accettato, impegnandomi a farle conoscere agli altri Assicurati che non potranno opporre la non conoscenza, le condizioni della polizza assicurativa, importo del premio incluso. Inoltre, dichiaro di conoscere l</w:t>
-                            </w:r>
-                            <w:r>
-                              <w:rPr>
-                                <w:sz w:val="20"/>
-                                <w:szCs w:val="20"/>
-                                <w:rtl w:val="0"/>
-                                <w:lang w:val="it-IT"/>
-                              </w:rPr>
-                              <w:t>’</w:t>
-                            </w:r>
-                            <w:r>
-                              <w:rPr>
-                                <w:sz w:val="20"/>
-                                <w:szCs w:val="20"/>
-                                <w:rtl w:val="0"/>
-                                <w:lang w:val="it-IT"/>
-                              </w:rPr>
-                              <w:t>informativa per il Trattamento dei Dati Personali, riportata nel set informativo ricevuto, e di prestare il consenso per il trattamento dei dati ivi indicati.</w:t>
+                              <w:t>Dichiaro di aver ricevuto la Documentazione Informativa Precontrattuale che disciplina il rapporto convenuto a mio favore tra CSA CONSULENZE &amp; SOLUZIONI AZIENDALI S.R.L. ed Inter Partner Assistance S.A. Rappresentanza Generale per L’Italia (Set Informativo), e di aver letto e accettato, impegnandomi a farle conoscere agli altri Assicurati che non potranno opporre la non conoscenza, le condizioni della polizza assicurativa, importo del premio incluso. Inoltre, dichiaro di conoscere l’informativa per il Trattamento dei Dati Personali, riportata nel set informativo ricevuto, e di prestare il consenso per il trattamento dei dati ivi indicati.</w:t>
                             </w:r>
                             <w:r>
                               <w:tab/>
@@ -3077,61 +2763,7 @@
                           <w:rtl w:val="0"/>
                           <w:lang w:val="it-IT"/>
                         </w:rPr>
-                        <w:t>Dichiaro di aver ricevuto</w:t>
-                      </w:r>
-                      <w:r>
-                        <w:rPr>
-                          <w:sz w:val="20"/>
-                          <w:szCs w:val="20"/>
-                          <w:rtl w:val="0"/>
-                          <w:lang w:val="it-IT"/>
-                        </w:rPr>
-                        <w:t> </w:t>
-                      </w:r>
-                      <w:r>
-                        <w:rPr>
-                          <w:sz w:val="20"/>
-                          <w:szCs w:val="20"/>
-                          <w:rtl w:val="0"/>
-                          <w:lang w:val="it-IT"/>
-                        </w:rPr>
-                        <w:t>la Documentazione Informativa Precontrattuale che disciplina il rapporto convenuto a mio favore tra CSA CONSULENZE &amp; SOLUZIONI AZIENDALI S.R.L. ed Inter Partner Assistance S.A. Rappresentanza Generale per L</w:t>
-                      </w:r>
-                      <w:r>
-                        <w:rPr>
-                          <w:sz w:val="20"/>
-                          <w:szCs w:val="20"/>
-                          <w:rtl w:val="0"/>
-                          <w:lang w:val="it-IT"/>
-                        </w:rPr>
-                        <w:t>’</w:t>
-                      </w:r>
-                      <w:r>
-                        <w:rPr>
-                          <w:sz w:val="20"/>
-                          <w:szCs w:val="20"/>
-                          <w:rtl w:val="0"/>
-                          <w:lang w:val="it-IT"/>
-                        </w:rPr>
-                        <w:t>Italia (Set Informativo), e di aver letto e accettato, impegnandomi a farle conoscere agli altri Assicurati che non potranno opporre la non conoscenza, le condizioni della polizza assicurativa, importo del premio incluso. Inoltre, dichiaro di conoscere l</w:t>
-                      </w:r>
-                      <w:r>
-                        <w:rPr>
-                          <w:sz w:val="20"/>
-                          <w:szCs w:val="20"/>
-                          <w:rtl w:val="0"/>
-                          <w:lang w:val="it-IT"/>
-                        </w:rPr>
-                        <w:t>’</w:t>
-                      </w:r>
-                      <w:r>
-                        <w:rPr>
-                          <w:sz w:val="20"/>
-                          <w:szCs w:val="20"/>
-                          <w:rtl w:val="0"/>
-                          <w:lang w:val="it-IT"/>
-                        </w:rPr>
-                        <w:t>informativa per il Trattamento dei Dati Personali, riportata nel set informativo ricevuto, e di prestare il consenso per il trattamento dei dati ivi indicati.</w:t>
+                        <w:t>Dichiaro di aver ricevuto la Documentazione Informativa Precontrattuale che disciplina il rapporto convenuto a mio favore tra CSA CONSULENZE &amp; SOLUZIONI AZIENDALI S.R.L. ed Inter Partner Assistance S.A. Rappresentanza Generale per L’Italia (Set Informativo), e di aver letto e accettato, impegnandomi a farle conoscere agli altri Assicurati che non potranno opporre la non conoscenza, le condizioni della polizza assicurativa, importo del premio incluso. Inoltre, dichiaro di conoscere l’informativa per il Trattamento dei Dati Personali, riportata nel set informativo ricevuto, e di prestare il consenso per il trattamento dei dati ivi indicati.</w:t>
                       </w:r>
                       <w:r>
                         <w:tab/>
@@ -3330,43 +2962,7 @@
                                 <w:rtl w:val="0"/>
                                 <w:lang w:val="it-IT"/>
                               </w:rPr>
-                              <w:t>Hai compreso che la polizza prevede esclusioni: es: conduzione del veicolo in stato di ebbrezza o sotto gli effetti di psicofarmaci nonch</w:t>
-                            </w:r>
-                            <w:r>
-                              <w:rPr>
-                                <w:sz w:val="20"/>
-                                <w:szCs w:val="20"/>
-                                <w:rtl w:val="0"/>
-                                <w:lang w:val="it-IT"/>
-                              </w:rPr>
-                              <w:t xml:space="preserve">é </w:t>
-                            </w:r>
-                            <w:r>
-                              <w:rPr>
-                                <w:sz w:val="20"/>
-                                <w:szCs w:val="20"/>
-                                <w:rtl w:val="0"/>
-                                <w:lang w:val="it-IT"/>
-                              </w:rPr>
-                              <w:t>dall</w:t>
-                            </w:r>
-                            <w:r>
-                              <w:rPr>
-                                <w:sz w:val="20"/>
-                                <w:szCs w:val="20"/>
-                                <w:rtl w:val="0"/>
-                                <w:lang w:val="it-IT"/>
-                              </w:rPr>
-                              <w:t>’</w:t>
-                            </w:r>
-                            <w:r>
-                              <w:rPr>
-                                <w:sz w:val="20"/>
-                                <w:szCs w:val="20"/>
-                                <w:rtl w:val="0"/>
-                                <w:lang w:val="it-IT"/>
-                              </w:rPr>
-                              <w:t>uso di stupefacenti e allucinogeni?</w:t>
+                              <w:t xml:space="preserve">Hai compreso che la polizza prevede esclusioni: es: conduzione del veicolo in stato di ebbrezza o sotto gli effetti di psicofarmaci nonché dall’uso di stupefacenti e allucinogeni?</w:t>
                             </w:r>
                           </w:p>
                           <w:p>
@@ -3486,43 +3082,7 @@
                           <w:rtl w:val="0"/>
                           <w:lang w:val="it-IT"/>
                         </w:rPr>
-                        <w:t>Hai compreso che la polizza prevede esclusioni: es: conduzione del veicolo in stato di ebbrezza o sotto gli effetti di psicofarmaci nonch</w:t>
-                      </w:r>
-                      <w:r>
-                        <w:rPr>
-                          <w:sz w:val="20"/>
-                          <w:szCs w:val="20"/>
-                          <w:rtl w:val="0"/>
-                          <w:lang w:val="it-IT"/>
-                        </w:rPr>
-                        <w:t xml:space="preserve">é </w:t>
-                      </w:r>
-                      <w:r>
-                        <w:rPr>
-                          <w:sz w:val="20"/>
-                          <w:szCs w:val="20"/>
-                          <w:rtl w:val="0"/>
-                          <w:lang w:val="it-IT"/>
-                        </w:rPr>
-                        <w:t>dall</w:t>
-                      </w:r>
-                      <w:r>
-                        <w:rPr>
-                          <w:sz w:val="20"/>
-                          <w:szCs w:val="20"/>
-                          <w:rtl w:val="0"/>
-                          <w:lang w:val="it-IT"/>
-                        </w:rPr>
-                        <w:t>’</w:t>
-                      </w:r>
-                      <w:r>
-                        <w:rPr>
-                          <w:sz w:val="20"/>
-                          <w:szCs w:val="20"/>
-                          <w:rtl w:val="0"/>
-                          <w:lang w:val="it-IT"/>
-                        </w:rPr>
-                        <w:t>uso di stupefacenti e allucinogeni?</w:t>
+                        <w:t xml:space="preserve">Hai compreso che la polizza prevede esclusioni: es: conduzione del veicolo in stato di ebbrezza o sotto gli effetti di psicofarmaci nonché dall’uso di stupefacenti e allucinogeni?</w:t>
                       </w:r>
                     </w:p>
                     <w:p>
@@ -3577,8 +3137,6 @@
             </w:pict>
           </mc:Fallback>
         </mc:AlternateContent>
-      </w:r>
-      <w:r>
         <w:tab/>
         <w:tab/>
         <w:tab/>
@@ -3622,61 +3180,7 @@
           <w:rtl w:val="0"/>
           <w:lang w:val="it-IT"/>
         </w:rPr>
-        <w:t xml:space="preserve">La seguente dichiarazione </w:t>
-      </w:r>
-      <w:r>
-        <w:rPr>
-          <w:sz w:val="20"/>
-          <w:szCs w:val="20"/>
-          <w:rtl w:val="0"/>
-          <w:lang w:val="it-IT"/>
-        </w:rPr>
-        <w:t xml:space="preserve">è </w:t>
-      </w:r>
-      <w:r>
-        <w:rPr>
-          <w:sz w:val="20"/>
-          <w:szCs w:val="20"/>
-          <w:rtl w:val="0"/>
-          <w:lang w:val="it-IT"/>
-        </w:rPr>
-        <w:t xml:space="preserve">valida solo in caso di risposta SI a tutte le domande del questionario; in caso di risposta NO anche ad una sola delle domande del questionario il contratto offerto non </w:t>
-      </w:r>
-      <w:r>
-        <w:rPr>
-          <w:sz w:val="20"/>
-          <w:szCs w:val="20"/>
-          <w:rtl w:val="0"/>
-          <w:lang w:val="it-IT"/>
-        </w:rPr>
-        <w:t xml:space="preserve">è </w:t>
-      </w:r>
-      <w:r>
-        <w:rPr>
-          <w:sz w:val="20"/>
-          <w:szCs w:val="20"/>
-          <w:rtl w:val="0"/>
-          <w:lang w:val="it-IT"/>
-        </w:rPr>
-        <w:t>coerente con le richieste ed esigenze del contraente e NON pu</w:t>
-      </w:r>
-      <w:r>
-        <w:rPr>
-          <w:sz w:val="20"/>
-          <w:szCs w:val="20"/>
-          <w:rtl w:val="0"/>
-          <w:lang w:val="it-IT"/>
-        </w:rPr>
-        <w:t xml:space="preserve">ò </w:t>
-      </w:r>
-      <w:r>
-        <w:rPr>
-          <w:sz w:val="20"/>
-          <w:szCs w:val="20"/>
-          <w:rtl w:val="0"/>
-          <w:lang w:val="it-IT"/>
-        </w:rPr>
-        <w:t>essere stipulato.</w:t>
+        <w:t xml:space="preserve">La seguente dichiarazione è valida solo in caso di risposta SI a tutte le domande del questionario; in caso di risposta NO anche ad una sola delle domande del questionario il contratto offerto non è coerente con le richieste ed esigenze del contraente e NON può essere stipulato.</w:t>
       </w:r>
     </w:p>
     <w:p>
@@ -3692,25 +3196,7 @@
           <w:rtl w:val="0"/>
           <w:lang w:val="it-IT"/>
         </w:rPr>
-        <w:t>In base alle informazioni raccolte dal Distributore, ai sensi di quanto previsto dalla normativa di recepimento della direttiva UE 2016/97 sulla distribuzione assicurativa (IDD) e in particolare dall</w:t>
-      </w:r>
-      <w:r>
-        <w:rPr>
-          <w:sz w:val="20"/>
-          <w:szCs w:val="20"/>
-          <w:rtl w:val="0"/>
-          <w:lang w:val="it-IT"/>
-        </w:rPr>
-        <w:t>’</w:t>
-      </w:r>
-      <w:r>
-        <w:rPr>
-          <w:sz w:val="20"/>
-          <w:szCs w:val="20"/>
-          <w:rtl w:val="0"/>
-          <w:lang w:val="it-IT"/>
-        </w:rPr>
-        <w:t>art. 58 del Regolamento IVASS n. 40 del 02/08/2018 la proposta risulta individuata in maniera coerente e risulta adeguata alle esigenze assicurative del cliente.</w:t>
+        <w:t>In base alle informazioni raccolte dal Distributore, ai sensi di quanto previsto dalla normativa di recepimento della direttiva UE 2016/97 sulla distribuzione assicurativa (IDD) e in particolare dall’art. 58 del Regolamento IVASS n. 40 del 02/08/2018 la proposta risulta individuata in maniera coerente e risulta adeguata alle esigenze assicurative del cliente.</w:t>
       </w:r>
     </w:p>
     <w:sectPr>

</xml_diff>